<commit_message>
Add video OCR module and refine report text
Introduce a new video OCR feature: add modules/video/video_api.py (upload/process/cleanup endpoints with SSE OCR processing using OpenCV + pytesseract), a client script static/js/video_ocr.js, a video workspace template, sample video and results. Register the video blueprint and expose /video route in app.py. Improve report generation logic in modules/report/gen_word.py: deterministic random phrasing, group multi-parameter limit sentences, adjust some quality labels, and vary MBA opening sentences. Also include minor template and word-template updates to support the new UI and outputs.
</commit_message>
<xml_diff>
--- a/static/word-template/device.docx
+++ b/static/word-template/device.docx
@@ -4,16 +4,18 @@
   <w:body>
     <w:p>
       <w:pPr>
-        <w:pStyle w:val="onvn"/>
+        <w:pStyle w:val="Doanvan"/>
         <w:rPr>
           <w:i/>
           <w:iCs/>
+          <w:u w:val="single"/>
         </w:rPr>
       </w:pPr>
       <w:r>
         <w:rPr>
           <w:i/>
           <w:iCs/>
+          <w:u w:val="single"/>
         </w:rPr>
         <w:t xml:space="preserve">{{ </w:t>
       </w:r>
@@ -22,6 +24,7 @@
         <w:rPr>
           <w:i/>
           <w:iCs/>
+          <w:u w:val="single"/>
         </w:rPr>
         <w:t>device_name</w:t>
       </w:r>
@@ -30,6 +33,7 @@
         <w:rPr>
           <w:i/>
           <w:iCs/>
+          <w:u w:val="single"/>
         </w:rPr>
         <w:t xml:space="preserve"> }}:</w:t>
       </w:r>
@@ -332,15 +336,9 @@
         <w:fldChar w:fldCharType="separate"/>
       </w:r>
       <w:r>
-        <w:rPr>
-          <w:noProof/>
-        </w:rPr>
         <w:t>1</w:t>
       </w:r>
       <w:r>
-        <w:rPr>
-          <w:noProof/>
-        </w:rPr>
         <w:fldChar w:fldCharType="end"/>
       </w:r>
       <w:r>
@@ -349,9 +347,10 @@
     </w:p>
     <w:p>
       <w:pPr>
-        <w:pStyle w:val="onvn"/>
+        <w:pStyle w:val="Doanvan"/>
         <w:rPr>
           <w:i/>
+          <w:iCs/>
           <w:lang w:eastAsia="vi-VN"/>
         </w:rPr>
       </w:pPr>
@@ -359,6 +358,7 @@
         <w:rPr>
           <w:b/>
           <w:i/>
+          <w:iCs/>
           <w:u w:val="single"/>
           <w:lang w:val="vi-VN" w:eastAsia="vi-VN"/>
         </w:rPr>
@@ -367,6 +367,7 @@
       <w:r>
         <w:rPr>
           <w:i/>
+          <w:iCs/>
           <w:lang w:val="vi-VN" w:eastAsia="vi-VN"/>
         </w:rPr>
         <w:t xml:space="preserve"> {{ remarks }}</w:t>
@@ -377,6 +378,7 @@
       <w:pgSz w:w="11907" w:h="16840"/>
       <w:pgMar w:top="862" w:right="936" w:bottom="720" w:left="1440" w:header="862" w:footer="720" w:gutter="0"/>
       <w:cols w:space="720"/>
+      <w:titlePg/>
       <w:docGrid w:linePitch="360"/>
     </w:sectPr>
   </w:body>

</xml_diff>

<commit_message>
Refresh Word document templates
Updated the device and MBA Word templates to reflect the latest form/layout changes.
</commit_message>
<xml_diff>
--- a/static/word-template/device.docx
+++ b/static/word-template/device.docx
@@ -1,7 +1,17 @@
 
 <file path=word/document.xml><?xml version="1.0" encoding="utf-8"?>
-<w:document xmlns:wpc="http://schemas.microsoft.com/office/word/2010/wordprocessingCanvas" xmlns:cx="http://schemas.microsoft.com/office/drawing/2014/chartex" xmlns:cx1="http://schemas.microsoft.com/office/drawing/2015/9/8/chartex" xmlns:cx2="http://schemas.microsoft.com/office/drawing/2015/10/21/chartex" xmlns:cx3="http://schemas.microsoft.com/office/drawing/2016/5/9/chartex" xmlns:cx4="http://schemas.microsoft.com/office/drawing/2016/5/10/chartex" xmlns:cx5="http://schemas.microsoft.com/office/drawing/2016/5/11/chartex" xmlns:cx6="http://schemas.microsoft.com/office/drawing/2016/5/12/chartex" xmlns:cx7="http://schemas.microsoft.com/office/drawing/2016/5/13/chartex" xmlns:cx8="http://schemas.microsoft.com/office/drawing/2016/5/14/chartex" xmlns:mc="http://schemas.openxmlformats.org/markup-compatibility/2006" xmlns:aink="http://schemas.microsoft.com/office/drawing/2016/ink" xmlns:am3d="http://schemas.microsoft.com/office/drawing/2017/model3d" xmlns:o="urn:schemas-microsoft-com:office:office" xmlns:oel="http://schemas.microsoft.com/office/2019/extlst" xmlns:r="http://schemas.openxmlformats.org/officeDocument/2006/relationships" xmlns:m="http://schemas.openxmlformats.org/officeDocument/2006/math" xmlns:v="urn:schemas-microsoft-com:vml" xmlns:wp14="http://schemas.microsoft.com/office/word/2010/wordprocessingDrawing" xmlns:wp="http://schemas.openxmlformats.org/drawingml/2006/wordprocessingDrawing" xmlns:w10="urn:schemas-microsoft-com:office:word" xmlns:w="http://schemas.openxmlformats.org/wordprocessingml/2006/main" xmlns:w14="http://schemas.microsoft.com/office/word/2010/wordml" xmlns:w15="http://schemas.microsoft.com/office/word/2012/wordml" xmlns:w16cex="http://schemas.microsoft.com/office/word/2018/wordml/cex" xmlns:w16cid="http://schemas.microsoft.com/office/word/2016/wordml/cid" xmlns:w16="http://schemas.microsoft.com/office/word/2018/wordml" xmlns:w16du="http://schemas.microsoft.com/office/word/2023/wordml/word16du" xmlns:w16sdtdh="http://schemas.microsoft.com/office/word/2020/wordml/sdtdatahash" xmlns:w16sdtfl="http://schemas.microsoft.com/office/word/2024/wordml/sdtformatlock" xmlns:w16se="http://schemas.microsoft.com/office/word/2015/wordml/symex" xmlns:wpg="http://schemas.microsoft.com/office/word/2010/wordprocessingGroup" xmlns:wpi="http://schemas.microsoft.com/office/word/2010/wordprocessingInk" xmlns:wne="http://schemas.microsoft.com/office/word/2006/wordml" xmlns:wps="http://schemas.microsoft.com/office/word/2010/wordprocessingShape" mc:Ignorable="w14 w15 w16se w16cid w16 w16cex w16sdtdh w16sdtfl w16du wp14">
+<w:document xmlns:wpc="http://schemas.microsoft.com/office/word/2010/wordprocessingCanvas" xmlns:cx="http://schemas.microsoft.com/office/drawing/2014/chartex" xmlns:cx1="http://schemas.microsoft.com/office/drawing/2015/9/8/chartex" xmlns:cx2="http://schemas.microsoft.com/office/drawing/2015/10/21/chartex" xmlns:cx3="http://schemas.microsoft.com/office/drawing/2016/5/9/chartex" xmlns:cx4="http://schemas.microsoft.com/office/drawing/2016/5/10/chartex" xmlns:cx5="http://schemas.microsoft.com/office/drawing/2016/5/11/chartex" xmlns:cx6="http://schemas.microsoft.com/office/drawing/2016/5/12/chartex" xmlns:cx7="http://schemas.microsoft.com/office/drawing/2016/5/13/chartex" xmlns:cx8="http://schemas.microsoft.com/office/drawing/2016/5/14/chartex" xmlns:mc="http://schemas.openxmlformats.org/markup-compatibility/2006" xmlns:m="http://schemas.openxmlformats.org/officeDocument/2006/math" xmlns:aink="http://schemas.microsoft.com/office/drawing/2016/ink" xmlns:am3d="http://schemas.microsoft.com/office/drawing/2017/model3d" xmlns:oel="http://schemas.microsoft.com/office/2019/extlst" xmlns:r="http://schemas.openxmlformats.org/officeDocument/2006/relationships" xmlns:wp14="http://schemas.microsoft.com/office/word/2010/wordprocessingDrawing" xmlns:wp="http://schemas.openxmlformats.org/drawingml/2006/wordprocessingDrawing" xmlns:wpg="http://schemas.microsoft.com/office/word/2010/wordprocessingGroup" xmlns:wpi="http://schemas.microsoft.com/office/word/2010/wordprocessingInk" xmlns:wps="http://schemas.microsoft.com/office/word/2010/wordprocessingShape" xmlns:o="urn:schemas-microsoft-com:office:office" xmlns:v="urn:schemas-microsoft-com:vml" xmlns:w10="urn:schemas-microsoft-com:office:word" xmlns:w="http://schemas.openxmlformats.org/wordprocessingml/2006/main" xmlns:w14="http://schemas.microsoft.com/office/word/2010/wordml" xmlns:w15="http://schemas.microsoft.com/office/word/2012/wordml" xmlns:w16cei="http://schemas.microsoft.com/office/word/2026/wordml/cei" xmlns:w16cex="http://schemas.microsoft.com/office/word/2018/wordml/cex" xmlns:w16cid="http://schemas.microsoft.com/office/word/2016/wordml/cid" xmlns:w16="http://schemas.microsoft.com/office/word/2018/wordml" xmlns:w16sdtdh="http://schemas.microsoft.com/office/word/2020/wordml/sdtdatahash" xmlns:w16sdtfl="http://schemas.microsoft.com/office/word/2024/wordml/sdtformatlock" xmlns:w16se="http://schemas.microsoft.com/office/word/2015/wordml/symex" xmlns:w16du="http://schemas.microsoft.com/office/word/2023/wordml/word16du" xmlns:wne="http://schemas.microsoft.com/office/word/2006/wordml" mc:Ignorable="w14 w15 w16se w16cid w16 w16cex w16sdtdh w16sdtfl w16du wp14">
   <w:body>
+    <w:p>
+      <w:pPr>
+        <w:pStyle w:val="Doanvan"/>
+        <w:rPr>
+          <w:i/>
+          <w:iCs/>
+          <w:u w:val="single"/>
+        </w:rPr>
+      </w:pPr>
+    </w:p>
     <w:p>
       <w:pPr>
         <w:pStyle w:val="Doanvan"/>
@@ -44,8 +54,8 @@
         <w:jc w:val="center"/>
         <w:tblLayout w:type="fixed"/>
         <w:tblCellMar>
-          <w:left w:w="115" w:type="dxa"/>
-          <w:right w:w="115" w:type="dxa"/>
+          <w:left w:w="0" w:type="dxa"/>
+          <w:right w:w="0" w:type="dxa"/>
         </w:tblCellMar>
         <w:tblLook w:val="04A0" w:firstRow="1" w:lastRow="0" w:firstColumn="1" w:lastColumn="0" w:noHBand="0" w:noVBand="1"/>
       </w:tblPr>
@@ -66,39 +76,19 @@
           </w:tcPr>
           <w:p>
             <w:pPr>
-              <w:pStyle w:val="onvn"/>
-              <w:jc w:val="center"/>
-              <w:rPr>
-                <w:rFonts w:ascii="Arial" w:hAnsi="Arial"/>
-                <w:lang w:val="en-GB"/>
-              </w:rPr>
+              <w:pStyle w:val="Hnhtrongbng"/>
             </w:pPr>
             <w:proofErr w:type="gramStart"/>
             <w:r>
-              <w:rPr>
-                <w:rFonts w:ascii="Arial" w:hAnsi="Arial"/>
-                <w:sz w:val="23"/>
-                <w:lang w:val="en-GB"/>
-              </w:rPr>
               <w:t xml:space="preserve">{{ </w:t>
             </w:r>
             <w:proofErr w:type="spellStart"/>
             <w:r>
-              <w:rPr>
-                <w:rFonts w:ascii="Arial" w:hAnsi="Arial"/>
-                <w:sz w:val="23"/>
-                <w:lang w:val="en-GB"/>
-              </w:rPr>
               <w:t>imga</w:t>
             </w:r>
             <w:proofErr w:type="spellEnd"/>
             <w:proofErr w:type="gramEnd"/>
             <w:r>
-              <w:rPr>
-                <w:rFonts w:ascii="Arial" w:hAnsi="Arial"/>
-                <w:sz w:val="23"/>
-                <w:lang w:val="en-GB"/>
-              </w:rPr>
               <w:t xml:space="preserve"> }}</w:t>
             </w:r>
           </w:p>
@@ -115,29 +105,14 @@
           </w:tcPr>
           <w:p>
             <w:pPr>
-              <w:pStyle w:val="onvn"/>
-              <w:jc w:val="center"/>
-              <w:rPr>
-                <w:rFonts w:ascii="Arial" w:hAnsi="Arial"/>
-                <w:lang w:val="en-GB"/>
-              </w:rPr>
+              <w:pStyle w:val="Hnhtrongbng"/>
             </w:pPr>
             <w:proofErr w:type="gramStart"/>
             <w:r>
-              <w:rPr>
-                <w:rFonts w:ascii="Arial" w:hAnsi="Arial"/>
-                <w:sz w:val="23"/>
-                <w:lang w:val="en-GB"/>
-              </w:rPr>
               <w:t>{{ img</w:t>
             </w:r>
             <w:proofErr w:type="gramEnd"/>
             <w:r>
-              <w:rPr>
-                <w:rFonts w:ascii="Arial" w:hAnsi="Arial"/>
-                <w:sz w:val="23"/>
-                <w:lang w:val="en-GB"/>
-              </w:rPr>
               <w:t>1 }}</w:t>
             </w:r>
           </w:p>
@@ -149,29 +124,14 @@
           </w:tcPr>
           <w:p>
             <w:pPr>
-              <w:pStyle w:val="onvn"/>
-              <w:jc w:val="center"/>
-              <w:rPr>
-                <w:rFonts w:ascii="Arial" w:hAnsi="Arial"/>
-                <w:lang w:val="en-GB"/>
-              </w:rPr>
+              <w:pStyle w:val="Hnhtrongbng"/>
             </w:pPr>
             <w:proofErr w:type="gramStart"/>
             <w:r>
-              <w:rPr>
-                <w:rFonts w:ascii="Arial" w:hAnsi="Arial"/>
-                <w:sz w:val="23"/>
-                <w:lang w:val="en-GB"/>
-              </w:rPr>
               <w:t>{{ img</w:t>
             </w:r>
             <w:proofErr w:type="gramEnd"/>
             <w:r>
-              <w:rPr>
-                <w:rFonts w:ascii="Arial" w:hAnsi="Arial"/>
-                <w:sz w:val="23"/>
-                <w:lang w:val="en-GB"/>
-              </w:rPr>
               <w:t>2 }}</w:t>
             </w:r>
           </w:p>
@@ -183,29 +143,14 @@
           </w:tcPr>
           <w:p>
             <w:pPr>
-              <w:pStyle w:val="onvn"/>
-              <w:jc w:val="center"/>
-              <w:rPr>
-                <w:rFonts w:ascii="Arial" w:hAnsi="Arial"/>
-                <w:lang w:val="en-GB"/>
-              </w:rPr>
+              <w:pStyle w:val="Hnhtrongbng"/>
             </w:pPr>
             <w:proofErr w:type="gramStart"/>
             <w:r>
-              <w:rPr>
-                <w:rFonts w:ascii="Arial" w:hAnsi="Arial"/>
-                <w:sz w:val="23"/>
-                <w:lang w:val="en-GB"/>
-              </w:rPr>
               <w:t>{{ img</w:t>
             </w:r>
             <w:proofErr w:type="gramEnd"/>
             <w:r>
-              <w:rPr>
-                <w:rFonts w:ascii="Arial" w:hAnsi="Arial"/>
-                <w:sz w:val="23"/>
-                <w:lang w:val="en-GB"/>
-              </w:rPr>
               <w:t>3 }}</w:t>
             </w:r>
           </w:p>
@@ -222,29 +167,14 @@
           </w:tcPr>
           <w:p>
             <w:pPr>
-              <w:pStyle w:val="onvn"/>
-              <w:jc w:val="center"/>
-              <w:rPr>
-                <w:rFonts w:ascii="Arial" w:hAnsi="Arial"/>
-                <w:lang w:val="en-GB"/>
-              </w:rPr>
+              <w:pStyle w:val="Hnhtrongbng"/>
             </w:pPr>
             <w:proofErr w:type="gramStart"/>
             <w:r>
-              <w:rPr>
-                <w:rFonts w:ascii="Arial" w:hAnsi="Arial"/>
-                <w:sz w:val="23"/>
-                <w:lang w:val="en-GB"/>
-              </w:rPr>
               <w:t>{{ img</w:t>
             </w:r>
             <w:proofErr w:type="gramEnd"/>
             <w:r>
-              <w:rPr>
-                <w:rFonts w:ascii="Arial" w:hAnsi="Arial"/>
-                <w:sz w:val="23"/>
-                <w:lang w:val="en-GB"/>
-              </w:rPr>
               <w:t>4 }}</w:t>
             </w:r>
           </w:p>
@@ -256,29 +186,14 @@
           </w:tcPr>
           <w:p>
             <w:pPr>
-              <w:pStyle w:val="onvn"/>
-              <w:jc w:val="center"/>
-              <w:rPr>
-                <w:rFonts w:ascii="Arial" w:hAnsi="Arial"/>
-                <w:lang w:val="en-GB"/>
-              </w:rPr>
+              <w:pStyle w:val="Hnhtrongbng"/>
             </w:pPr>
             <w:proofErr w:type="gramStart"/>
             <w:r>
-              <w:rPr>
-                <w:rFonts w:ascii="Arial" w:hAnsi="Arial"/>
-                <w:sz w:val="23"/>
-                <w:lang w:val="en-GB"/>
-              </w:rPr>
               <w:t>{{ img</w:t>
             </w:r>
             <w:proofErr w:type="gramEnd"/>
             <w:r>
-              <w:rPr>
-                <w:rFonts w:ascii="Arial" w:hAnsi="Arial"/>
-                <w:sz w:val="23"/>
-                <w:lang w:val="en-GB"/>
-              </w:rPr>
               <w:t>5 }}</w:t>
             </w:r>
           </w:p>
@@ -290,29 +205,14 @@
           </w:tcPr>
           <w:p>
             <w:pPr>
-              <w:pStyle w:val="onvn"/>
-              <w:jc w:val="center"/>
-              <w:rPr>
-                <w:rFonts w:ascii="Arial" w:hAnsi="Arial"/>
-                <w:lang w:val="en-GB"/>
-              </w:rPr>
+              <w:pStyle w:val="Hnhtrongbng"/>
             </w:pPr>
             <w:proofErr w:type="gramStart"/>
             <w:r>
-              <w:rPr>
-                <w:rFonts w:ascii="Arial" w:hAnsi="Arial"/>
-                <w:sz w:val="23"/>
-                <w:lang w:val="en-GB"/>
-              </w:rPr>
               <w:t>{{ img</w:t>
             </w:r>
             <w:proofErr w:type="gramEnd"/>
             <w:r>
-              <w:rPr>
-                <w:rFonts w:ascii="Arial" w:hAnsi="Arial"/>
-                <w:sz w:val="23"/>
-                <w:lang w:val="en-GB"/>
-              </w:rPr>
               <w:t>6 }}</w:t>
             </w:r>
           </w:p>
@@ -386,7 +286,7 @@
 </file>
 
 <file path=word/endnotes.xml><?xml version="1.0" encoding="utf-8"?>
-<w:endnotes xmlns:wpc="http://schemas.microsoft.com/office/word/2010/wordprocessingCanvas" xmlns:cx="http://schemas.microsoft.com/office/drawing/2014/chartex" xmlns:cx1="http://schemas.microsoft.com/office/drawing/2015/9/8/chartex" xmlns:cx2="http://schemas.microsoft.com/office/drawing/2015/10/21/chartex" xmlns:cx3="http://schemas.microsoft.com/office/drawing/2016/5/9/chartex" xmlns:cx4="http://schemas.microsoft.com/office/drawing/2016/5/10/chartex" xmlns:cx5="http://schemas.microsoft.com/office/drawing/2016/5/11/chartex" xmlns:cx6="http://schemas.microsoft.com/office/drawing/2016/5/12/chartex" xmlns:cx7="http://schemas.microsoft.com/office/drawing/2016/5/13/chartex" xmlns:cx8="http://schemas.microsoft.com/office/drawing/2016/5/14/chartex" xmlns:mc="http://schemas.openxmlformats.org/markup-compatibility/2006" xmlns:aink="http://schemas.microsoft.com/office/drawing/2016/ink" xmlns:am3d="http://schemas.microsoft.com/office/drawing/2017/model3d" xmlns:o="urn:schemas-microsoft-com:office:office" xmlns:oel="http://schemas.microsoft.com/office/2019/extlst" xmlns:r="http://schemas.openxmlformats.org/officeDocument/2006/relationships" xmlns:m="http://schemas.openxmlformats.org/officeDocument/2006/math" xmlns:v="urn:schemas-microsoft-com:vml" xmlns:wp14="http://schemas.microsoft.com/office/word/2010/wordprocessingDrawing" xmlns:wp="http://schemas.openxmlformats.org/drawingml/2006/wordprocessingDrawing" xmlns:w10="urn:schemas-microsoft-com:office:word" xmlns:w="http://schemas.openxmlformats.org/wordprocessingml/2006/main" xmlns:w14="http://schemas.microsoft.com/office/word/2010/wordml" xmlns:w15="http://schemas.microsoft.com/office/word/2012/wordml" xmlns:w16cex="http://schemas.microsoft.com/office/word/2018/wordml/cex" xmlns:w16cid="http://schemas.microsoft.com/office/word/2016/wordml/cid" xmlns:w16="http://schemas.microsoft.com/office/word/2018/wordml" xmlns:w16du="http://schemas.microsoft.com/office/word/2023/wordml/word16du" xmlns:w16sdtdh="http://schemas.microsoft.com/office/word/2020/wordml/sdtdatahash" xmlns:w16sdtfl="http://schemas.microsoft.com/office/word/2024/wordml/sdtformatlock" xmlns:w16se="http://schemas.microsoft.com/office/word/2015/wordml/symex" xmlns:wpg="http://schemas.microsoft.com/office/word/2010/wordprocessingGroup" xmlns:wpi="http://schemas.microsoft.com/office/word/2010/wordprocessingInk" xmlns:wne="http://schemas.microsoft.com/office/word/2006/wordml" xmlns:wps="http://schemas.microsoft.com/office/word/2010/wordprocessingShape" mc:Ignorable="w14 w15 w16se w16cid w16 w16cex w16sdtdh w16sdtfl w16du wp14">
+<w:endnotes xmlns:wpc="http://schemas.microsoft.com/office/word/2010/wordprocessingCanvas" xmlns:cx="http://schemas.microsoft.com/office/drawing/2014/chartex" xmlns:cx1="http://schemas.microsoft.com/office/drawing/2015/9/8/chartex" xmlns:cx2="http://schemas.microsoft.com/office/drawing/2015/10/21/chartex" xmlns:cx3="http://schemas.microsoft.com/office/drawing/2016/5/9/chartex" xmlns:cx4="http://schemas.microsoft.com/office/drawing/2016/5/10/chartex" xmlns:cx5="http://schemas.microsoft.com/office/drawing/2016/5/11/chartex" xmlns:cx6="http://schemas.microsoft.com/office/drawing/2016/5/12/chartex" xmlns:cx7="http://schemas.microsoft.com/office/drawing/2016/5/13/chartex" xmlns:cx8="http://schemas.microsoft.com/office/drawing/2016/5/14/chartex" xmlns:mc="http://schemas.openxmlformats.org/markup-compatibility/2006" xmlns:m="http://schemas.openxmlformats.org/officeDocument/2006/math" xmlns:aink="http://schemas.microsoft.com/office/drawing/2016/ink" xmlns:am3d="http://schemas.microsoft.com/office/drawing/2017/model3d" xmlns:oel="http://schemas.microsoft.com/office/2019/extlst" xmlns:r="http://schemas.openxmlformats.org/officeDocument/2006/relationships" xmlns:wp14="http://schemas.microsoft.com/office/word/2010/wordprocessingDrawing" xmlns:wp="http://schemas.openxmlformats.org/drawingml/2006/wordprocessingDrawing" xmlns:wpg="http://schemas.microsoft.com/office/word/2010/wordprocessingGroup" xmlns:wpi="http://schemas.microsoft.com/office/word/2010/wordprocessingInk" xmlns:wps="http://schemas.microsoft.com/office/word/2010/wordprocessingShape" xmlns:o="urn:schemas-microsoft-com:office:office" xmlns:v="urn:schemas-microsoft-com:vml" xmlns:w10="urn:schemas-microsoft-com:office:word" xmlns:w="http://schemas.openxmlformats.org/wordprocessingml/2006/main" xmlns:w14="http://schemas.microsoft.com/office/word/2010/wordml" xmlns:w15="http://schemas.microsoft.com/office/word/2012/wordml" xmlns:w16cei="http://schemas.microsoft.com/office/word/2026/wordml/cei" xmlns:w16cex="http://schemas.microsoft.com/office/word/2018/wordml/cex" xmlns:w16cid="http://schemas.microsoft.com/office/word/2016/wordml/cid" xmlns:w16="http://schemas.microsoft.com/office/word/2018/wordml" xmlns:w16sdtdh="http://schemas.microsoft.com/office/word/2020/wordml/sdtdatahash" xmlns:w16sdtfl="http://schemas.microsoft.com/office/word/2024/wordml/sdtformatlock" xmlns:w16se="http://schemas.microsoft.com/office/word/2015/wordml/symex" xmlns:w16du="http://schemas.microsoft.com/office/word/2023/wordml/word16du" xmlns:wne="http://schemas.microsoft.com/office/word/2006/wordml" mc:Ignorable="w14 w15 w16se w16cid w16 w16cex w16sdtdh w16sdtfl w16du wp14">
   <w:endnote w:type="separator" w:id="-1">
     <w:p>
       <w:r>
@@ -405,7 +305,7 @@
 </file>
 
 <file path=word/footnotes.xml><?xml version="1.0" encoding="utf-8"?>
-<w:footnotes xmlns:wpc="http://schemas.microsoft.com/office/word/2010/wordprocessingCanvas" xmlns:cx="http://schemas.microsoft.com/office/drawing/2014/chartex" xmlns:cx1="http://schemas.microsoft.com/office/drawing/2015/9/8/chartex" xmlns:cx2="http://schemas.microsoft.com/office/drawing/2015/10/21/chartex" xmlns:cx3="http://schemas.microsoft.com/office/drawing/2016/5/9/chartex" xmlns:cx4="http://schemas.microsoft.com/office/drawing/2016/5/10/chartex" xmlns:cx5="http://schemas.microsoft.com/office/drawing/2016/5/11/chartex" xmlns:cx6="http://schemas.microsoft.com/office/drawing/2016/5/12/chartex" xmlns:cx7="http://schemas.microsoft.com/office/drawing/2016/5/13/chartex" xmlns:cx8="http://schemas.microsoft.com/office/drawing/2016/5/14/chartex" xmlns:mc="http://schemas.openxmlformats.org/markup-compatibility/2006" xmlns:aink="http://schemas.microsoft.com/office/drawing/2016/ink" xmlns:am3d="http://schemas.microsoft.com/office/drawing/2017/model3d" xmlns:o="urn:schemas-microsoft-com:office:office" xmlns:oel="http://schemas.microsoft.com/office/2019/extlst" xmlns:r="http://schemas.openxmlformats.org/officeDocument/2006/relationships" xmlns:m="http://schemas.openxmlformats.org/officeDocument/2006/math" xmlns:v="urn:schemas-microsoft-com:vml" xmlns:wp14="http://schemas.microsoft.com/office/word/2010/wordprocessingDrawing" xmlns:wp="http://schemas.openxmlformats.org/drawingml/2006/wordprocessingDrawing" xmlns:w10="urn:schemas-microsoft-com:office:word" xmlns:w="http://schemas.openxmlformats.org/wordprocessingml/2006/main" xmlns:w14="http://schemas.microsoft.com/office/word/2010/wordml" xmlns:w15="http://schemas.microsoft.com/office/word/2012/wordml" xmlns:w16cex="http://schemas.microsoft.com/office/word/2018/wordml/cex" xmlns:w16cid="http://schemas.microsoft.com/office/word/2016/wordml/cid" xmlns:w16="http://schemas.microsoft.com/office/word/2018/wordml" xmlns:w16du="http://schemas.microsoft.com/office/word/2023/wordml/word16du" xmlns:w16sdtdh="http://schemas.microsoft.com/office/word/2020/wordml/sdtdatahash" xmlns:w16sdtfl="http://schemas.microsoft.com/office/word/2024/wordml/sdtformatlock" xmlns:w16se="http://schemas.microsoft.com/office/word/2015/wordml/symex" xmlns:wpg="http://schemas.microsoft.com/office/word/2010/wordprocessingGroup" xmlns:wpi="http://schemas.microsoft.com/office/word/2010/wordprocessingInk" xmlns:wne="http://schemas.microsoft.com/office/word/2006/wordml" xmlns:wps="http://schemas.microsoft.com/office/word/2010/wordprocessingShape" mc:Ignorable="w14 w15 w16se w16cid w16 w16cex w16sdtdh w16sdtfl w16du wp14">
+<w:footnotes xmlns:wpc="http://schemas.microsoft.com/office/word/2010/wordprocessingCanvas" xmlns:cx="http://schemas.microsoft.com/office/drawing/2014/chartex" xmlns:cx1="http://schemas.microsoft.com/office/drawing/2015/9/8/chartex" xmlns:cx2="http://schemas.microsoft.com/office/drawing/2015/10/21/chartex" xmlns:cx3="http://schemas.microsoft.com/office/drawing/2016/5/9/chartex" xmlns:cx4="http://schemas.microsoft.com/office/drawing/2016/5/10/chartex" xmlns:cx5="http://schemas.microsoft.com/office/drawing/2016/5/11/chartex" xmlns:cx6="http://schemas.microsoft.com/office/drawing/2016/5/12/chartex" xmlns:cx7="http://schemas.microsoft.com/office/drawing/2016/5/13/chartex" xmlns:cx8="http://schemas.microsoft.com/office/drawing/2016/5/14/chartex" xmlns:mc="http://schemas.openxmlformats.org/markup-compatibility/2006" xmlns:m="http://schemas.openxmlformats.org/officeDocument/2006/math" xmlns:aink="http://schemas.microsoft.com/office/drawing/2016/ink" xmlns:am3d="http://schemas.microsoft.com/office/drawing/2017/model3d" xmlns:oel="http://schemas.microsoft.com/office/2019/extlst" xmlns:r="http://schemas.openxmlformats.org/officeDocument/2006/relationships" xmlns:wp14="http://schemas.microsoft.com/office/word/2010/wordprocessingDrawing" xmlns:wp="http://schemas.openxmlformats.org/drawingml/2006/wordprocessingDrawing" xmlns:wpg="http://schemas.microsoft.com/office/word/2010/wordprocessingGroup" xmlns:wpi="http://schemas.microsoft.com/office/word/2010/wordprocessingInk" xmlns:wps="http://schemas.microsoft.com/office/word/2010/wordprocessingShape" xmlns:o="urn:schemas-microsoft-com:office:office" xmlns:v="urn:schemas-microsoft-com:vml" xmlns:w10="urn:schemas-microsoft-com:office:word" xmlns:w="http://schemas.openxmlformats.org/wordprocessingml/2006/main" xmlns:w14="http://schemas.microsoft.com/office/word/2010/wordml" xmlns:w15="http://schemas.microsoft.com/office/word/2012/wordml" xmlns:w16cei="http://schemas.microsoft.com/office/word/2026/wordml/cei" xmlns:w16cex="http://schemas.microsoft.com/office/word/2018/wordml/cex" xmlns:w16cid="http://schemas.microsoft.com/office/word/2016/wordml/cid" xmlns:w16="http://schemas.microsoft.com/office/word/2018/wordml" xmlns:w16sdtdh="http://schemas.microsoft.com/office/word/2020/wordml/sdtdatahash" xmlns:w16sdtfl="http://schemas.microsoft.com/office/word/2024/wordml/sdtformatlock" xmlns:w16se="http://schemas.microsoft.com/office/word/2015/wordml/symex" xmlns:w16du="http://schemas.microsoft.com/office/word/2023/wordml/word16du" xmlns:wne="http://schemas.microsoft.com/office/word/2006/wordml" mc:Ignorable="w14 w15 w16se w16cid w16 w16cex w16sdtdh w16sdtfl w16du wp14">
   <w:footnote w:type="separator" w:id="-1">
     <w:p>
       <w:r>
@@ -424,7 +324,7 @@
 </file>
 
 <file path=word/header1.xml><?xml version="1.0" encoding="utf-8"?>
-<w:hdr xmlns:wpc="http://schemas.microsoft.com/office/word/2010/wordprocessingCanvas" xmlns:cx="http://schemas.microsoft.com/office/drawing/2014/chartex" xmlns:cx1="http://schemas.microsoft.com/office/drawing/2015/9/8/chartex" xmlns:cx2="http://schemas.microsoft.com/office/drawing/2015/10/21/chartex" xmlns:cx3="http://schemas.microsoft.com/office/drawing/2016/5/9/chartex" xmlns:cx4="http://schemas.microsoft.com/office/drawing/2016/5/10/chartex" xmlns:cx5="http://schemas.microsoft.com/office/drawing/2016/5/11/chartex" xmlns:cx6="http://schemas.microsoft.com/office/drawing/2016/5/12/chartex" xmlns:cx7="http://schemas.microsoft.com/office/drawing/2016/5/13/chartex" xmlns:cx8="http://schemas.microsoft.com/office/drawing/2016/5/14/chartex" xmlns:mc="http://schemas.openxmlformats.org/markup-compatibility/2006" xmlns:aink="http://schemas.microsoft.com/office/drawing/2016/ink" xmlns:am3d="http://schemas.microsoft.com/office/drawing/2017/model3d" xmlns:o="urn:schemas-microsoft-com:office:office" xmlns:oel="http://schemas.microsoft.com/office/2019/extlst" xmlns:r="http://schemas.openxmlformats.org/officeDocument/2006/relationships" xmlns:m="http://schemas.openxmlformats.org/officeDocument/2006/math" xmlns:v="urn:schemas-microsoft-com:vml" xmlns:wp14="http://schemas.microsoft.com/office/word/2010/wordprocessingDrawing" xmlns:wp="http://schemas.openxmlformats.org/drawingml/2006/wordprocessingDrawing" xmlns:w10="urn:schemas-microsoft-com:office:word" xmlns:w="http://schemas.openxmlformats.org/wordprocessingml/2006/main" xmlns:w14="http://schemas.microsoft.com/office/word/2010/wordml" xmlns:w15="http://schemas.microsoft.com/office/word/2012/wordml" xmlns:w16cex="http://schemas.microsoft.com/office/word/2018/wordml/cex" xmlns:w16cid="http://schemas.microsoft.com/office/word/2016/wordml/cid" xmlns:w16="http://schemas.microsoft.com/office/word/2018/wordml" xmlns:w16du="http://schemas.microsoft.com/office/word/2023/wordml/word16du" xmlns:w16sdtdh="http://schemas.microsoft.com/office/word/2020/wordml/sdtdatahash" xmlns:w16sdtfl="http://schemas.microsoft.com/office/word/2024/wordml/sdtformatlock" xmlns:w16se="http://schemas.microsoft.com/office/word/2015/wordml/symex" xmlns:wpg="http://schemas.microsoft.com/office/word/2010/wordprocessingGroup" xmlns:wpi="http://schemas.microsoft.com/office/word/2010/wordprocessingInk" xmlns:wne="http://schemas.microsoft.com/office/word/2006/wordml" xmlns:wps="http://schemas.microsoft.com/office/word/2010/wordprocessingShape" mc:Ignorable="w14 w15 w16se w16cid w16 w16cex w16sdtdh w16sdtfl w16du wp14">
+<w:hdr xmlns:wpc="http://schemas.microsoft.com/office/word/2010/wordprocessingCanvas" xmlns:cx="http://schemas.microsoft.com/office/drawing/2014/chartex" xmlns:cx1="http://schemas.microsoft.com/office/drawing/2015/9/8/chartex" xmlns:cx2="http://schemas.microsoft.com/office/drawing/2015/10/21/chartex" xmlns:cx3="http://schemas.microsoft.com/office/drawing/2016/5/9/chartex" xmlns:cx4="http://schemas.microsoft.com/office/drawing/2016/5/10/chartex" xmlns:cx5="http://schemas.microsoft.com/office/drawing/2016/5/11/chartex" xmlns:cx6="http://schemas.microsoft.com/office/drawing/2016/5/12/chartex" xmlns:cx7="http://schemas.microsoft.com/office/drawing/2016/5/13/chartex" xmlns:cx8="http://schemas.microsoft.com/office/drawing/2016/5/14/chartex" xmlns:mc="http://schemas.openxmlformats.org/markup-compatibility/2006" xmlns:m="http://schemas.openxmlformats.org/officeDocument/2006/math" xmlns:aink="http://schemas.microsoft.com/office/drawing/2016/ink" xmlns:am3d="http://schemas.microsoft.com/office/drawing/2017/model3d" xmlns:oel="http://schemas.microsoft.com/office/2019/extlst" xmlns:r="http://schemas.openxmlformats.org/officeDocument/2006/relationships" xmlns:wp14="http://schemas.microsoft.com/office/word/2010/wordprocessingDrawing" xmlns:wp="http://schemas.openxmlformats.org/drawingml/2006/wordprocessingDrawing" xmlns:wpg="http://schemas.microsoft.com/office/word/2010/wordprocessingGroup" xmlns:wpi="http://schemas.microsoft.com/office/word/2010/wordprocessingInk" xmlns:wps="http://schemas.microsoft.com/office/word/2010/wordprocessingShape" xmlns:o="urn:schemas-microsoft-com:office:office" xmlns:v="urn:schemas-microsoft-com:vml" xmlns:w10="urn:schemas-microsoft-com:office:word" xmlns:w="http://schemas.openxmlformats.org/wordprocessingml/2006/main" xmlns:w14="http://schemas.microsoft.com/office/word/2010/wordml" xmlns:w15="http://schemas.microsoft.com/office/word/2012/wordml" xmlns:w16cei="http://schemas.microsoft.com/office/word/2026/wordml/cei" xmlns:w16cex="http://schemas.microsoft.com/office/word/2018/wordml/cex" xmlns:w16cid="http://schemas.microsoft.com/office/word/2016/wordml/cid" xmlns:w16="http://schemas.microsoft.com/office/word/2018/wordml" xmlns:w16sdtdh="http://schemas.microsoft.com/office/word/2020/wordml/sdtdatahash" xmlns:w16sdtfl="http://schemas.microsoft.com/office/word/2024/wordml/sdtformatlock" xmlns:w16se="http://schemas.microsoft.com/office/word/2015/wordml/symex" xmlns:w16du="http://schemas.microsoft.com/office/word/2023/wordml/word16du" xmlns:wne="http://schemas.microsoft.com/office/word/2006/wordml" mc:Ignorable="w14 w15 w16se w16cid w16 w16cex w16sdtdh w16sdtfl w16du wp14">
   <w:p>
     <w:pPr>
       <w:pStyle w:val="Header"/>
@@ -450,7 +350,7 @@
 </file>
 
 <file path=word/numbering.xml><?xml version="1.0" encoding="utf-8"?>
-<w:numbering xmlns:wpc="http://schemas.microsoft.com/office/word/2010/wordprocessingCanvas" xmlns:cx="http://schemas.microsoft.com/office/drawing/2014/chartex" xmlns:cx1="http://schemas.microsoft.com/office/drawing/2015/9/8/chartex" xmlns:cx2="http://schemas.microsoft.com/office/drawing/2015/10/21/chartex" xmlns:cx3="http://schemas.microsoft.com/office/drawing/2016/5/9/chartex" xmlns:cx4="http://schemas.microsoft.com/office/drawing/2016/5/10/chartex" xmlns:cx5="http://schemas.microsoft.com/office/drawing/2016/5/11/chartex" xmlns:cx6="http://schemas.microsoft.com/office/drawing/2016/5/12/chartex" xmlns:cx7="http://schemas.microsoft.com/office/drawing/2016/5/13/chartex" xmlns:cx8="http://schemas.microsoft.com/office/drawing/2016/5/14/chartex" xmlns:mc="http://schemas.openxmlformats.org/markup-compatibility/2006" xmlns:aink="http://schemas.microsoft.com/office/drawing/2016/ink" xmlns:am3d="http://schemas.microsoft.com/office/drawing/2017/model3d" xmlns:o="urn:schemas-microsoft-com:office:office" xmlns:oel="http://schemas.microsoft.com/office/2019/extlst" xmlns:r="http://schemas.openxmlformats.org/officeDocument/2006/relationships" xmlns:m="http://schemas.openxmlformats.org/officeDocument/2006/math" xmlns:v="urn:schemas-microsoft-com:vml" xmlns:wp14="http://schemas.microsoft.com/office/word/2010/wordprocessingDrawing" xmlns:wp="http://schemas.openxmlformats.org/drawingml/2006/wordprocessingDrawing" xmlns:w10="urn:schemas-microsoft-com:office:word" xmlns:w="http://schemas.openxmlformats.org/wordprocessingml/2006/main" xmlns:w14="http://schemas.microsoft.com/office/word/2010/wordml" xmlns:w15="http://schemas.microsoft.com/office/word/2012/wordml" xmlns:w16cex="http://schemas.microsoft.com/office/word/2018/wordml/cex" xmlns:w16cid="http://schemas.microsoft.com/office/word/2016/wordml/cid" xmlns:w16="http://schemas.microsoft.com/office/word/2018/wordml" xmlns:w16du="http://schemas.microsoft.com/office/word/2023/wordml/word16du" xmlns:w16sdtdh="http://schemas.microsoft.com/office/word/2020/wordml/sdtdatahash" xmlns:w16sdtfl="http://schemas.microsoft.com/office/word/2024/wordml/sdtformatlock" xmlns:w16se="http://schemas.microsoft.com/office/word/2015/wordml/symex" xmlns:wpg="http://schemas.microsoft.com/office/word/2010/wordprocessingGroup" xmlns:wpi="http://schemas.microsoft.com/office/word/2010/wordprocessingInk" xmlns:wne="http://schemas.microsoft.com/office/word/2006/wordml" xmlns:wps="http://schemas.microsoft.com/office/word/2010/wordprocessingShape" mc:Ignorable="w14 w15 w16se w16cid w16 w16cex w16sdtdh w16sdtfl w16du wp14">
+<w:numbering xmlns:wpc="http://schemas.microsoft.com/office/word/2010/wordprocessingCanvas" xmlns:cx="http://schemas.microsoft.com/office/drawing/2014/chartex" xmlns:cx1="http://schemas.microsoft.com/office/drawing/2015/9/8/chartex" xmlns:cx2="http://schemas.microsoft.com/office/drawing/2015/10/21/chartex" xmlns:cx3="http://schemas.microsoft.com/office/drawing/2016/5/9/chartex" xmlns:cx4="http://schemas.microsoft.com/office/drawing/2016/5/10/chartex" xmlns:cx5="http://schemas.microsoft.com/office/drawing/2016/5/11/chartex" xmlns:cx6="http://schemas.microsoft.com/office/drawing/2016/5/12/chartex" xmlns:cx7="http://schemas.microsoft.com/office/drawing/2016/5/13/chartex" xmlns:cx8="http://schemas.microsoft.com/office/drawing/2016/5/14/chartex" xmlns:mc="http://schemas.openxmlformats.org/markup-compatibility/2006" xmlns:m="http://schemas.openxmlformats.org/officeDocument/2006/math" xmlns:aink="http://schemas.microsoft.com/office/drawing/2016/ink" xmlns:am3d="http://schemas.microsoft.com/office/drawing/2017/model3d" xmlns:oel="http://schemas.microsoft.com/office/2019/extlst" xmlns:r="http://schemas.openxmlformats.org/officeDocument/2006/relationships" xmlns:wp14="http://schemas.microsoft.com/office/word/2010/wordprocessingDrawing" xmlns:wp="http://schemas.openxmlformats.org/drawingml/2006/wordprocessingDrawing" xmlns:wpg="http://schemas.microsoft.com/office/word/2010/wordprocessingGroup" xmlns:wpi="http://schemas.microsoft.com/office/word/2010/wordprocessingInk" xmlns:wps="http://schemas.microsoft.com/office/word/2010/wordprocessingShape" xmlns:o="urn:schemas-microsoft-com:office:office" xmlns:v="urn:schemas-microsoft-com:vml" xmlns:w10="urn:schemas-microsoft-com:office:word" xmlns:w="http://schemas.openxmlformats.org/wordprocessingml/2006/main" xmlns:w14="http://schemas.microsoft.com/office/word/2010/wordml" xmlns:w15="http://schemas.microsoft.com/office/word/2012/wordml" xmlns:w16cei="http://schemas.microsoft.com/office/word/2026/wordml/cei" xmlns:w16cex="http://schemas.microsoft.com/office/word/2018/wordml/cex" xmlns:w16cid="http://schemas.microsoft.com/office/word/2016/wordml/cid" xmlns:w16="http://schemas.microsoft.com/office/word/2018/wordml" xmlns:w16sdtdh="http://schemas.microsoft.com/office/word/2020/wordml/sdtdatahash" xmlns:w16sdtfl="http://schemas.microsoft.com/office/word/2024/wordml/sdtformatlock" xmlns:w16se="http://schemas.microsoft.com/office/word/2015/wordml/symex" xmlns:w16du="http://schemas.microsoft.com/office/word/2023/wordml/word16du" xmlns:wne="http://schemas.microsoft.com/office/word/2006/wordml" mc:Ignorable="w14 w15 w16se w16cid w16 w16cex w16sdtdh w16sdtfl w16du wp14">
   <w:abstractNum w:abstractNumId="0" w15:restartNumberingAfterBreak="0">
     <w:nsid w:val="0DA94513"/>
     <w:multiLevelType w:val="multilevel"/>
@@ -1295,7 +1195,7 @@
 </file>
 
 <file path=word/styles.xml><?xml version="1.0" encoding="utf-8"?>
-<w:styles xmlns:mc="http://schemas.openxmlformats.org/markup-compatibility/2006" xmlns:r="http://schemas.openxmlformats.org/officeDocument/2006/relationships" xmlns:w="http://schemas.openxmlformats.org/wordprocessingml/2006/main" xmlns:w14="http://schemas.microsoft.com/office/word/2010/wordml" xmlns:w15="http://schemas.microsoft.com/office/word/2012/wordml" xmlns:w16cex="http://schemas.microsoft.com/office/word/2018/wordml/cex" xmlns:w16cid="http://schemas.microsoft.com/office/word/2016/wordml/cid" xmlns:w16="http://schemas.microsoft.com/office/word/2018/wordml" xmlns:w16du="http://schemas.microsoft.com/office/word/2023/wordml/word16du" xmlns:w16sdtdh="http://schemas.microsoft.com/office/word/2020/wordml/sdtdatahash" xmlns:w16sdtfl="http://schemas.microsoft.com/office/word/2024/wordml/sdtformatlock" xmlns:w16se="http://schemas.microsoft.com/office/word/2015/wordml/symex" mc:Ignorable="w14 w15 w16se w16cid w16 w16cex w16sdtdh w16sdtfl w16du">
+<w:styles xmlns:mc="http://schemas.openxmlformats.org/markup-compatibility/2006" xmlns:r="http://schemas.openxmlformats.org/officeDocument/2006/relationships" xmlns:w="http://schemas.openxmlformats.org/wordprocessingml/2006/main" xmlns:w14="http://schemas.microsoft.com/office/word/2010/wordml" xmlns:w15="http://schemas.microsoft.com/office/word/2012/wordml" xmlns:w16cex="http://schemas.microsoft.com/office/word/2018/wordml/cex" xmlns:w16cid="http://schemas.microsoft.com/office/word/2016/wordml/cid" xmlns:w16="http://schemas.microsoft.com/office/word/2018/wordml" xmlns:w16sdtdh="http://schemas.microsoft.com/office/word/2020/wordml/sdtdatahash" xmlns:w16sdtfl="http://schemas.microsoft.com/office/word/2024/wordml/sdtformatlock" xmlns:w16se="http://schemas.microsoft.com/office/word/2015/wordml/symex" xmlns:w16du="http://schemas.microsoft.com/office/word/2023/wordml/word16du" mc:Ignorable="w14 w15 w16se w16cid w16 w16cex w16sdtdh w16sdtfl w16du">
   <w:docDefaults>
     <w:rPrDefault>
       <w:rPr>

</xml_diff>

<commit_message>
Refine report remark scoring and phrasing
Improves Word report remark generation with domain-aware severity scoring by load type (PF, current unbalance, harmonics, overload), updated quality mapping, and more specific PF descriptors for device remarks. MBA remarks now omit PF sentence when cosφ is low, device remark assembly is unified, repeated intro phrases are de-duplicated, and stable-load cases replace “công suất tức thời” with “công suất”.

Also updates Vietnamese remark templates to reduce repetitive openings, tighten load phrasing, normalize power formatting, and align the generated output with updated device Word templates.
</commit_message>
<xml_diff>
--- a/static/word-template/device.docx
+++ b/static/word-template/device.docx
@@ -2,16 +2,6 @@
 <file path=word/document.xml><?xml version="1.0" encoding="utf-8"?>
 <w:document xmlns:wpc="http://schemas.microsoft.com/office/word/2010/wordprocessingCanvas" xmlns:cx="http://schemas.microsoft.com/office/drawing/2014/chartex" xmlns:cx1="http://schemas.microsoft.com/office/drawing/2015/9/8/chartex" xmlns:cx2="http://schemas.microsoft.com/office/drawing/2015/10/21/chartex" xmlns:cx3="http://schemas.microsoft.com/office/drawing/2016/5/9/chartex" xmlns:cx4="http://schemas.microsoft.com/office/drawing/2016/5/10/chartex" xmlns:cx5="http://schemas.microsoft.com/office/drawing/2016/5/11/chartex" xmlns:cx6="http://schemas.microsoft.com/office/drawing/2016/5/12/chartex" xmlns:cx7="http://schemas.microsoft.com/office/drawing/2016/5/13/chartex" xmlns:cx8="http://schemas.microsoft.com/office/drawing/2016/5/14/chartex" xmlns:mc="http://schemas.openxmlformats.org/markup-compatibility/2006" xmlns:m="http://schemas.openxmlformats.org/officeDocument/2006/math" xmlns:aink="http://schemas.microsoft.com/office/drawing/2016/ink" xmlns:am3d="http://schemas.microsoft.com/office/drawing/2017/model3d" xmlns:oel="http://schemas.microsoft.com/office/2019/extlst" xmlns:r="http://schemas.openxmlformats.org/officeDocument/2006/relationships" xmlns:wp14="http://schemas.microsoft.com/office/word/2010/wordprocessingDrawing" xmlns:wp="http://schemas.openxmlformats.org/drawingml/2006/wordprocessingDrawing" xmlns:wpg="http://schemas.microsoft.com/office/word/2010/wordprocessingGroup" xmlns:wpi="http://schemas.microsoft.com/office/word/2010/wordprocessingInk" xmlns:wps="http://schemas.microsoft.com/office/word/2010/wordprocessingShape" xmlns:o="urn:schemas-microsoft-com:office:office" xmlns:v="urn:schemas-microsoft-com:vml" xmlns:w10="urn:schemas-microsoft-com:office:word" xmlns:w="http://schemas.openxmlformats.org/wordprocessingml/2006/main" xmlns:w14="http://schemas.microsoft.com/office/word/2010/wordml" xmlns:w15="http://schemas.microsoft.com/office/word/2012/wordml" xmlns:w16cei="http://schemas.microsoft.com/office/word/2026/wordml/cei" xmlns:w16cex="http://schemas.microsoft.com/office/word/2018/wordml/cex" xmlns:w16cid="http://schemas.microsoft.com/office/word/2016/wordml/cid" xmlns:w16="http://schemas.microsoft.com/office/word/2018/wordml" xmlns:w16sdtdh="http://schemas.microsoft.com/office/word/2020/wordml/sdtdatahash" xmlns:w16sdtfl="http://schemas.microsoft.com/office/word/2024/wordml/sdtformatlock" xmlns:w16se="http://schemas.microsoft.com/office/word/2015/wordml/symex" xmlns:w16du="http://schemas.microsoft.com/office/word/2023/wordml/word16du" xmlns:wne="http://schemas.microsoft.com/office/word/2006/wordml" mc:Ignorable="w14 w15 w16se w16cid w16 w16cex w16sdtdh w16sdtfl w16du wp14">
   <w:body>
-    <w:p>
-      <w:pPr>
-        <w:pStyle w:val="Doanvan"/>
-        <w:rPr>
-          <w:i/>
-          <w:iCs/>
-          <w:u w:val="single"/>
-        </w:rPr>
-      </w:pPr>
-    </w:p>
     <w:p>
       <w:pPr>
         <w:pStyle w:val="Doanvan"/>
@@ -78,7 +68,6 @@
             <w:pPr>
               <w:pStyle w:val="Hnhtrongbng"/>
             </w:pPr>
-            <w:proofErr w:type="gramStart"/>
             <w:r>
               <w:t xml:space="preserve">{{ </w:t>
             </w:r>
@@ -87,7 +76,6 @@
               <w:t>imga</w:t>
             </w:r>
             <w:proofErr w:type="spellEnd"/>
-            <w:proofErr w:type="gramEnd"/>
             <w:r>
               <w:t xml:space="preserve"> }}</w:t>
             </w:r>
@@ -107,13 +95,8 @@
             <w:pPr>
               <w:pStyle w:val="Hnhtrongbng"/>
             </w:pPr>
-            <w:proofErr w:type="gramStart"/>
             <w:r>
-              <w:t>{{ img</w:t>
-            </w:r>
-            <w:proofErr w:type="gramEnd"/>
-            <w:r>
-              <w:t>1 }}</w:t>
+              <w:t>{{ img1 }}</w:t>
             </w:r>
           </w:p>
         </w:tc>
@@ -126,13 +109,8 @@
             <w:pPr>
               <w:pStyle w:val="Hnhtrongbng"/>
             </w:pPr>
-            <w:proofErr w:type="gramStart"/>
             <w:r>
-              <w:t>{{ img</w:t>
-            </w:r>
-            <w:proofErr w:type="gramEnd"/>
-            <w:r>
-              <w:t>2 }}</w:t>
+              <w:t>{{ img2 }}</w:t>
             </w:r>
           </w:p>
         </w:tc>
@@ -145,13 +123,8 @@
             <w:pPr>
               <w:pStyle w:val="Hnhtrongbng"/>
             </w:pPr>
-            <w:proofErr w:type="gramStart"/>
             <w:r>
-              <w:t>{{ img</w:t>
-            </w:r>
-            <w:proofErr w:type="gramEnd"/>
-            <w:r>
-              <w:t>3 }}</w:t>
+              <w:t>{{ img3 }}</w:t>
             </w:r>
           </w:p>
         </w:tc>
@@ -169,13 +142,8 @@
             <w:pPr>
               <w:pStyle w:val="Hnhtrongbng"/>
             </w:pPr>
-            <w:proofErr w:type="gramStart"/>
             <w:r>
-              <w:t>{{ img</w:t>
-            </w:r>
-            <w:proofErr w:type="gramEnd"/>
-            <w:r>
-              <w:t>4 }}</w:t>
+              <w:t>{{ img4 }}</w:t>
             </w:r>
           </w:p>
         </w:tc>
@@ -188,13 +156,8 @@
             <w:pPr>
               <w:pStyle w:val="Hnhtrongbng"/>
             </w:pPr>
-            <w:proofErr w:type="gramStart"/>
             <w:r>
-              <w:t>{{ img</w:t>
-            </w:r>
-            <w:proofErr w:type="gramEnd"/>
-            <w:r>
-              <w:t>5 }}</w:t>
+              <w:t>{{ img5 }}</w:t>
             </w:r>
           </w:p>
         </w:tc>
@@ -207,13 +170,8 @@
             <w:pPr>
               <w:pStyle w:val="Hnhtrongbng"/>
             </w:pPr>
-            <w:proofErr w:type="gramStart"/>
             <w:r>
-              <w:t>{{ img</w:t>
-            </w:r>
-            <w:proofErr w:type="gramEnd"/>
-            <w:r>
-              <w:t>6 }}</w:t>
+              <w:t>{{ img6 }}</w:t>
             </w:r>
           </w:p>
         </w:tc>

</xml_diff>